<commit_message>
Job hunting is so tough, aaghh, I wanna cry
</commit_message>
<xml_diff>
--- a/programming_mental_models/p2_implementation_of_programming_mental_models.docx
+++ b/programming_mental_models/p2_implementation_of_programming_mental_models.docx
@@ -38,23 +38,7 @@
           <w:sz w:val="36"/>
           <w:szCs w:val="36"/>
         </w:rPr>
-        <w:t>Implementation of SSH Key…………………………………</w:t>
-      </w:r>
-      <w:proofErr w:type="gramStart"/>
-      <w:r>
-        <w:rPr>
-          <w:sz w:val="36"/>
-          <w:szCs w:val="36"/>
-        </w:rPr>
-        <w:t>…..</w:t>
-      </w:r>
-      <w:proofErr w:type="gramEnd"/>
-      <w:r>
-        <w:rPr>
-          <w:sz w:val="36"/>
-          <w:szCs w:val="36"/>
-        </w:rPr>
-        <w:t>2</w:t>
+        <w:t>Implementation of SSH Key……………………………………..2</w:t>
       </w:r>
     </w:p>
     <w:p>
@@ -200,7 +184,6 @@
         <w:t xml:space="preserve">git clone </w:t>
       </w:r>
       <w:proofErr w:type="spellStart"/>
-      <w:proofErr w:type="gramStart"/>
       <w:r>
         <w:rPr>
           <w:b/>
@@ -234,7 +217,6 @@
         <w:t>repo.git</w:t>
       </w:r>
       <w:proofErr w:type="spellEnd"/>
-      <w:proofErr w:type="gramEnd"/>
     </w:p>
     <w:p>
       <w:pPr>
@@ -1856,9 +1838,9 @@
           <w:sz w:val="32"/>
           <w:szCs w:val="32"/>
         </w:rPr>
-        <w:t>256 SHA256:Qn8zg</w:t>
-      </w:r>
-      <w:proofErr w:type="gramStart"/>
+        <w:t>256 SHA256:Qn8zg…..</w:t>
+      </w:r>
+      <w:proofErr w:type="spellStart"/>
       <w:r>
         <w:rPr>
           <w:b/>
@@ -1866,10 +1848,9 @@
           <w:sz w:val="32"/>
           <w:szCs w:val="32"/>
         </w:rPr>
-        <w:t>…..</w:t>
-      </w:r>
-      <w:proofErr w:type="spellStart"/>
-      <w:proofErr w:type="gramEnd"/>
+        <w:t>FCbw</w:t>
+      </w:r>
+      <w:proofErr w:type="spellEnd"/>
       <w:r>
         <w:rPr>
           <w:b/>
@@ -1877,16 +1858,6 @@
           <w:sz w:val="32"/>
           <w:szCs w:val="32"/>
         </w:rPr>
-        <w:t>FCbw</w:t>
-      </w:r>
-      <w:proofErr w:type="spellEnd"/>
-      <w:r>
-        <w:rPr>
-          <w:b/>
-          <w:bCs/>
-          <w:sz w:val="32"/>
-          <w:szCs w:val="32"/>
-        </w:rPr>
         <w:t xml:space="preserve"> nhasanr18@gmail.com (ED25519)</w:t>
       </w:r>
     </w:p>
@@ -1989,17 +1960,7 @@
           <w:szCs w:val="34"/>
         </w:rPr>
         <w:lastRenderedPageBreak/>
-        <w:t>ssh-ed25519 AAAA1l……</w:t>
-      </w:r>
-      <w:proofErr w:type="gramStart"/>
-      <w:r>
-        <w:rPr>
-          <w:b/>
-          <w:bCs/>
-          <w:sz w:val="34"/>
-          <w:szCs w:val="34"/>
-        </w:rPr>
-        <w:t>….</w:t>
+        <w:t>ssh-ed25519 AAAA1l……….</w:t>
       </w:r>
       <w:proofErr w:type="spellStart"/>
       <w:r>
@@ -2009,17 +1970,7 @@
           <w:sz w:val="34"/>
           <w:szCs w:val="34"/>
         </w:rPr>
-        <w:t>Sk</w:t>
-      </w:r>
-      <w:proofErr w:type="gramEnd"/>
-      <w:r>
-        <w:rPr>
-          <w:b/>
-          <w:bCs/>
-          <w:sz w:val="34"/>
-          <w:szCs w:val="34"/>
-        </w:rPr>
-        <w:t>+hXV</w:t>
+        <w:t>Sk+hXV</w:t>
       </w:r>
       <w:proofErr w:type="spellEnd"/>
       <w:r>
@@ -2431,7 +2382,6 @@
         </w:rPr>
       </w:pPr>
       <w:proofErr w:type="spellStart"/>
-      <w:proofErr w:type="gramStart"/>
       <w:r>
         <w:rPr>
           <w:b/>
@@ -2463,7 +2413,6 @@
         <w:t>repo.git</w:t>
       </w:r>
       <w:proofErr w:type="spellEnd"/>
-      <w:proofErr w:type="gramEnd"/>
     </w:p>
     <w:p>
       <w:pPr>
@@ -2503,7 +2452,6 @@
         <w:t xml:space="preserve">git clone </w:t>
       </w:r>
       <w:proofErr w:type="spellStart"/>
-      <w:proofErr w:type="gramStart"/>
       <w:r>
         <w:rPr>
           <w:b/>
@@ -2537,7 +2485,6 @@
         <w:t>repo.git</w:t>
       </w:r>
       <w:proofErr w:type="spellEnd"/>
-      <w:proofErr w:type="gramEnd"/>
     </w:p>
     <w:p>
       <w:pPr>
@@ -2574,20 +2521,8 @@
           <w:sz w:val="34"/>
           <w:szCs w:val="34"/>
         </w:rPr>
-        <w:t xml:space="preserve">git </w:t>
-      </w:r>
-      <w:proofErr w:type="gramStart"/>
-      <w:r>
-        <w:rPr>
-          <w:b/>
-          <w:bCs/>
-          <w:color w:val="60CAF3" w:themeColor="accent4" w:themeTint="99"/>
-          <w:sz w:val="34"/>
-          <w:szCs w:val="34"/>
-        </w:rPr>
-        <w:t>pull</w:t>
-      </w:r>
-      <w:proofErr w:type="gramEnd"/>
+        <w:t>git pull</w:t>
+      </w:r>
     </w:p>
     <w:p>
       <w:pPr>
@@ -3058,6 +2993,31 @@
           <w:szCs w:val="36"/>
         </w:rPr>
         <w:t>Break</w:t>
+      </w:r>
+    </w:p>
+    <w:p>
+      <w:pPr>
+        <w:jc w:val="both"/>
+        <w:rPr>
+          <w:sz w:val="36"/>
+          <w:szCs w:val="36"/>
+        </w:rPr>
+      </w:pPr>
+    </w:p>
+    <w:p>
+      <w:pPr>
+        <w:jc w:val="both"/>
+        <w:rPr>
+          <w:sz w:val="36"/>
+          <w:szCs w:val="36"/>
+        </w:rPr>
+      </w:pPr>
+      <w:r>
+        <w:rPr>
+          <w:sz w:val="36"/>
+          <w:szCs w:val="36"/>
+        </w:rPr>
+        <w:t>I don’t Know:</w:t>
       </w:r>
     </w:p>
     <w:p>

</xml_diff>